<commit_message>
Added ur pilz module
</commit_message>
<xml_diff>
--- a/ReadMe.docx
+++ b/ReadMe.docx
@@ -1732,47 +1732,112 @@
       <w:pPr>
         <w:pStyle w:val="Normal"/>
         <w:rPr>
-          <w:b w:val="false"/>
-          <w:b w:val="false"/>
-          <w:bCs w:val="false"/>
-        </w:rPr>
-      </w:pPr>
-      <w:r>
-        <w:rPr>
-          <w:b w:val="false"/>
-          <w:bCs w:val="false"/>
-        </w:rPr>
-      </w:r>
-    </w:p>
-    <w:p>
-      <w:pPr>
-        <w:pStyle w:val="Normal"/>
-        <w:rPr>
-          <w:b w:val="false"/>
-          <w:b w:val="false"/>
-          <w:bCs w:val="false"/>
-        </w:rPr>
-      </w:pPr>
-      <w:r>
-        <w:rPr>
-          <w:b w:val="false"/>
-          <w:bCs w:val="false"/>
-        </w:rPr>
-      </w:r>
-    </w:p>
-    <w:p>
-      <w:pPr>
-        <w:pStyle w:val="Normal"/>
-        <w:rPr>
-          <w:b w:val="false"/>
-          <w:b w:val="false"/>
-          <w:bCs w:val="false"/>
-        </w:rPr>
-      </w:pPr>
-      <w:r>
-        <w:rPr>
-          <w:b w:val="false"/>
-          <w:bCs w:val="false"/>
+          <w:b/>
+          <w:b/>
+          <w:bCs/>
+        </w:rPr>
+      </w:pPr>
+      <w:r>
+        <w:rPr>
+          <w:b/>
+          <w:bCs/>
+        </w:rPr>
+        <w:t>OPC UA:</w:t>
+      </w:r>
+    </w:p>
+    <w:p>
+      <w:pPr>
+        <w:pStyle w:val="Normal"/>
+        <w:rPr>
+          <w:b w:val="false"/>
+          <w:b w:val="false"/>
+          <w:bCs w:val="false"/>
+        </w:rPr>
+      </w:pPr>
+      <w:r>
+        <w:rPr>
+          <w:b w:val="false"/>
+          <w:bCs w:val="false"/>
+        </w:rPr>
+        <w:t xml:space="preserve">Installation über </w:t>
+      </w:r>
+    </w:p>
+    <w:p>
+      <w:pPr>
+        <w:pStyle w:val="Normal"/>
+        <w:rPr/>
+      </w:pPr>
+      <w:r>
+        <w:rPr>
+          <w:b w:val="false"/>
+          <w:bCs w:val="false"/>
+        </w:rPr>
+        <w:t>pip install ipcua</w:t>
+      </w:r>
+    </w:p>
+    <w:p>
+      <w:pPr>
+        <w:pStyle w:val="Normal"/>
+        <w:rPr>
+          <w:b/>
+          <w:b/>
+          <w:bCs/>
+        </w:rPr>
+      </w:pPr>
+      <w:r>
+        <w:rPr>
+          <w:b/>
+          <w:bCs/>
+        </w:rPr>
+      </w:r>
+    </w:p>
+    <w:p>
+      <w:pPr>
+        <w:pStyle w:val="Normal"/>
+        <w:rPr>
+          <w:b/>
+          <w:b/>
+          <w:bCs/>
+        </w:rPr>
+      </w:pPr>
+      <w:r>
+        <w:rPr>
+          <w:b/>
+          <w:bCs/>
+        </w:rPr>
+        <w:t>Setzen der IP-Adresse</w:t>
+      </w:r>
+    </w:p>
+    <w:p>
+      <w:pPr>
+        <w:pStyle w:val="Normal"/>
+        <w:rPr>
+          <w:b w:val="false"/>
+          <w:b w:val="false"/>
+          <w:bCs w:val="false"/>
+        </w:rPr>
+      </w:pPr>
+      <w:r>
+        <w:rPr>
+          <w:b w:val="false"/>
+          <w:bCs w:val="false"/>
+        </w:rPr>
+        <w:t xml:space="preserve">Um eine Verbindung zum UR-Roboter herstellen zu können, muss Ubuntu 22.04 </w:t>
+      </w:r>
+    </w:p>
+    <w:p>
+      <w:pPr>
+        <w:pStyle w:val="Normal"/>
+        <w:rPr>
+          <w:b/>
+          <w:b/>
+          <w:bCs/>
+        </w:rPr>
+      </w:pPr>
+      <w:r>
+        <w:rPr>
+          <w:b/>
+          <w:bCs/>
         </w:rPr>
       </w:r>
     </w:p>
@@ -1791,56 +1856,6 @@
           <w:bCs w:val="false"/>
         </w:rPr>
         <w:t>Starten des MoveIt-Knotens:</w:t>
-      </w:r>
-    </w:p>
-    <w:p>
-      <w:pPr>
-        <w:pStyle w:val="Normal"/>
-        <w:rPr>
-          <w:b/>
-          <w:b/>
-          <w:bCs/>
-        </w:rPr>
-      </w:pPr>
-      <w:r>
-        <w:rPr>
-          <w:b/>
-          <w:bCs/>
-        </w:rPr>
-      </w:r>
-    </w:p>
-    <w:p>
-      <w:pPr>
-        <w:pStyle w:val="Normal"/>
-        <w:rPr>
-          <w:b/>
-          <w:b/>
-          <w:bCs/>
-        </w:rPr>
-      </w:pPr>
-      <w:r>
-        <w:rPr>
-          <w:b/>
-          <w:bCs/>
-        </w:rPr>
-        <w:t>Setzen der IP-Adresse</w:t>
-      </w:r>
-    </w:p>
-    <w:p>
-      <w:pPr>
-        <w:pStyle w:val="Normal"/>
-        <w:rPr>
-          <w:b w:val="false"/>
-          <w:b w:val="false"/>
-          <w:bCs w:val="false"/>
-        </w:rPr>
-      </w:pPr>
-      <w:r>
-        <w:rPr>
-          <w:b w:val="false"/>
-          <w:bCs w:val="false"/>
-        </w:rPr>
-        <w:t xml:space="preserve">Um eine Verbindung zum UR-Roboter herstellen zu können, muss Ubuntu 22.04 </w:t>
       </w:r>
     </w:p>
     <w:p>

</xml_diff>